<commit_message>
replaced the word thesans template after making some slight changes to the format of the headers (bold now) and increasing font size
</commit_message>
<xml_diff>
--- a/inst/quarto/templates/word/resources/uhh-template-thesansuhh.docx
+++ b/inst/quarto/templates/word/resources/uhh-template-thesansuhh.docx
@@ -1,6 +1,6 @@
 
 <file path=word/document.xml><?xml version="1.0" encoding="utf-8"?>
-<w:document xmlns:wpc="http://schemas.microsoft.com/office/word/2010/wordprocessingCanvas" xmlns:cx="http://schemas.microsoft.com/office/drawing/2014/chartex" xmlns:cx1="http://schemas.microsoft.com/office/drawing/2015/9/8/chartex" xmlns:cx2="http://schemas.microsoft.com/office/drawing/2015/10/21/chartex" xmlns:cx3="http://schemas.microsoft.com/office/drawing/2016/5/9/chartex" xmlns:cx4="http://schemas.microsoft.com/office/drawing/2016/5/10/chartex" xmlns:cx5="http://schemas.microsoft.com/office/drawing/2016/5/11/chartex" xmlns:cx6="http://schemas.microsoft.com/office/drawing/2016/5/12/chartex" xmlns:cx7="http://schemas.microsoft.com/office/drawing/2016/5/13/chartex" xmlns:cx8="http://schemas.microsoft.com/office/drawing/2016/5/14/chartex" xmlns:mc="http://schemas.openxmlformats.org/markup-compatibility/2006" xmlns:aink="http://schemas.microsoft.com/office/drawing/2016/ink" xmlns:am3d="http://schemas.microsoft.com/office/drawing/2017/model3d" xmlns:o="urn:schemas-microsoft-com:office:office" xmlns:oel="http://schemas.microsoft.com/office/2019/extlst" xmlns:r="http://schemas.openxmlformats.org/officeDocument/2006/relationships" xmlns:m="http://schemas.openxmlformats.org/officeDocument/2006/math" xmlns:v="urn:schemas-microsoft-com:vml" xmlns:wp14="http://schemas.microsoft.com/office/word/2010/wordprocessingDrawing" xmlns:wp="http://schemas.openxmlformats.org/drawingml/2006/wordprocessingDrawing" xmlns:w10="urn:schemas-microsoft-com:office:word" xmlns:w="http://schemas.openxmlformats.org/wordprocessingml/2006/main" xmlns:w14="http://schemas.microsoft.com/office/word/2010/wordml" xmlns:w15="http://schemas.microsoft.com/office/word/2012/wordml" xmlns:w16cex="http://schemas.microsoft.com/office/word/2018/wordml/cex" xmlns:w16cid="http://schemas.microsoft.com/office/word/2016/wordml/cid" xmlns:w16="http://schemas.microsoft.com/office/word/2018/wordml" xmlns:w16sdtdh="http://schemas.microsoft.com/office/word/2020/wordml/sdtdatahash" xmlns:w16se="http://schemas.microsoft.com/office/word/2015/wordml/symex" xmlns:wpg="http://schemas.microsoft.com/office/word/2010/wordprocessingGroup" xmlns:wpi="http://schemas.microsoft.com/office/word/2010/wordprocessingInk" xmlns:wne="http://schemas.microsoft.com/office/word/2006/wordml" xmlns:wps="http://schemas.microsoft.com/office/word/2010/wordprocessingShape" mc:Ignorable="w14 w15 w16se w16cid w16 w16cex w16sdtdh wp14">
+<w:document xmlns:wpc="http://schemas.microsoft.com/office/word/2010/wordprocessingCanvas" xmlns:cx="http://schemas.microsoft.com/office/drawing/2014/chartex" xmlns:cx1="http://schemas.microsoft.com/office/drawing/2015/9/8/chartex" xmlns:cx2="http://schemas.microsoft.com/office/drawing/2015/10/21/chartex" xmlns:cx3="http://schemas.microsoft.com/office/drawing/2016/5/9/chartex" xmlns:cx4="http://schemas.microsoft.com/office/drawing/2016/5/10/chartex" xmlns:cx5="http://schemas.microsoft.com/office/drawing/2016/5/11/chartex" xmlns:cx6="http://schemas.microsoft.com/office/drawing/2016/5/12/chartex" xmlns:cx7="http://schemas.microsoft.com/office/drawing/2016/5/13/chartex" xmlns:cx8="http://schemas.microsoft.com/office/drawing/2016/5/14/chartex" xmlns:mc="http://schemas.openxmlformats.org/markup-compatibility/2006" xmlns:aink="http://schemas.microsoft.com/office/drawing/2016/ink" xmlns:am3d="http://schemas.microsoft.com/office/drawing/2017/model3d" xmlns:o="urn:schemas-microsoft-com:office:office" xmlns:oel="http://schemas.microsoft.com/office/2019/extlst" xmlns:r="http://schemas.openxmlformats.org/officeDocument/2006/relationships" xmlns:m="http://schemas.openxmlformats.org/officeDocument/2006/math" xmlns:v="urn:schemas-microsoft-com:vml" xmlns:wp14="http://schemas.microsoft.com/office/word/2010/wordprocessingDrawing" xmlns:wp="http://schemas.openxmlformats.org/drawingml/2006/wordprocessingDrawing" xmlns:w10="urn:schemas-microsoft-com:office:word" xmlns:w="http://schemas.openxmlformats.org/wordprocessingml/2006/main" xmlns:w14="http://schemas.microsoft.com/office/word/2010/wordml" xmlns:w15="http://schemas.microsoft.com/office/word/2012/wordml" xmlns:w16cex="http://schemas.microsoft.com/office/word/2018/wordml/cex" xmlns:w16cid="http://schemas.microsoft.com/office/word/2016/wordml/cid" xmlns:w16="http://schemas.microsoft.com/office/word/2018/wordml" xmlns:w16du="http://schemas.microsoft.com/office/word/2023/wordml/word16du" xmlns:w16sdtdh="http://schemas.microsoft.com/office/word/2020/wordml/sdtdatahash" xmlns:w16sdtfl="http://schemas.microsoft.com/office/word/2024/wordml/sdtformatlock" xmlns:w16se="http://schemas.microsoft.com/office/word/2015/wordml/symex" xmlns:wpg="http://schemas.microsoft.com/office/word/2010/wordprocessingGroup" xmlns:wpi="http://schemas.microsoft.com/office/word/2010/wordprocessingInk" xmlns:wne="http://schemas.microsoft.com/office/word/2006/wordml" xmlns:wps="http://schemas.microsoft.com/office/word/2010/wordprocessingShape" mc:Ignorable="w14 w15 w16se w16cid w16 w16cex w16sdtdh w16sdtfl w16du wp14">
   <w:body>
     <w:p>
       <w:pPr>
@@ -43,8 +43,15 @@
     <w:p>
       <w:pPr>
         <w:pStyle w:val="Author"/>
+        <w:rPr>
+          <w:b w:val="0"/>
+          <w:bCs/>
+        </w:rPr>
       </w:pPr>
       <w:r>
+        <w:rPr>
+          <w:bCs/>
+        </w:rPr>
         <w:t>Author Name</w:t>
       </w:r>
     </w:p>
@@ -67,7 +74,15 @@
         <w:pStyle w:val="Abstract"/>
       </w:pPr>
       <w:r>
-        <w:t xml:space="preserve">Lorem ipsum dolor sit </w:t>
+        <w:t xml:space="preserve">Lorem ipsum dolor </w:t>
+      </w:r>
+      <w:proofErr w:type="gramStart"/>
+      <w:r>
+        <w:t>sit</w:t>
+      </w:r>
+      <w:proofErr w:type="gramEnd"/>
+      <w:r>
+        <w:t xml:space="preserve"> </w:t>
       </w:r>
       <w:proofErr w:type="spellStart"/>
       <w:r>
@@ -126,6 +141,13 @@
         <w:t>.</w:t>
       </w:r>
     </w:p>
+    <w:p>
+      <w:pPr>
+        <w:rPr>
+          <w:lang w:val="en-US"/>
+        </w:rPr>
+      </w:pPr>
+    </w:p>
     <w:sectPr>
       <w:headerReference w:type="even" r:id="rId7"/>
       <w:headerReference w:type="default" r:id="rId8"/>
@@ -144,7 +166,7 @@
 </file>
 
 <file path=word/endnotes.xml><?xml version="1.0" encoding="utf-8"?>
-<w:endnotes xmlns:wpc="http://schemas.microsoft.com/office/word/2010/wordprocessingCanvas" xmlns:cx="http://schemas.microsoft.com/office/drawing/2014/chartex" xmlns:cx1="http://schemas.microsoft.com/office/drawing/2015/9/8/chartex" xmlns:cx2="http://schemas.microsoft.com/office/drawing/2015/10/21/chartex" xmlns:cx3="http://schemas.microsoft.com/office/drawing/2016/5/9/chartex" xmlns:cx4="http://schemas.microsoft.com/office/drawing/2016/5/10/chartex" xmlns:cx5="http://schemas.microsoft.com/office/drawing/2016/5/11/chartex" xmlns:cx6="http://schemas.microsoft.com/office/drawing/2016/5/12/chartex" xmlns:cx7="http://schemas.microsoft.com/office/drawing/2016/5/13/chartex" xmlns:cx8="http://schemas.microsoft.com/office/drawing/2016/5/14/chartex" xmlns:mc="http://schemas.openxmlformats.org/markup-compatibility/2006" xmlns:aink="http://schemas.microsoft.com/office/drawing/2016/ink" xmlns:am3d="http://schemas.microsoft.com/office/drawing/2017/model3d" xmlns:o="urn:schemas-microsoft-com:office:office" xmlns:oel="http://schemas.microsoft.com/office/2019/extlst" xmlns:r="http://schemas.openxmlformats.org/officeDocument/2006/relationships" xmlns:m="http://schemas.openxmlformats.org/officeDocument/2006/math" xmlns:v="urn:schemas-microsoft-com:vml" xmlns:wp14="http://schemas.microsoft.com/office/word/2010/wordprocessingDrawing" xmlns:wp="http://schemas.openxmlformats.org/drawingml/2006/wordprocessingDrawing" xmlns:w10="urn:schemas-microsoft-com:office:word" xmlns:w="http://schemas.openxmlformats.org/wordprocessingml/2006/main" xmlns:w14="http://schemas.microsoft.com/office/word/2010/wordml" xmlns:w15="http://schemas.microsoft.com/office/word/2012/wordml" xmlns:w16cex="http://schemas.microsoft.com/office/word/2018/wordml/cex" xmlns:w16cid="http://schemas.microsoft.com/office/word/2016/wordml/cid" xmlns:w16="http://schemas.microsoft.com/office/word/2018/wordml" xmlns:w16sdtdh="http://schemas.microsoft.com/office/word/2020/wordml/sdtdatahash" xmlns:w16se="http://schemas.microsoft.com/office/word/2015/wordml/symex" xmlns:wpg="http://schemas.microsoft.com/office/word/2010/wordprocessingGroup" xmlns:wpi="http://schemas.microsoft.com/office/word/2010/wordprocessingInk" xmlns:wne="http://schemas.microsoft.com/office/word/2006/wordml" xmlns:wps="http://schemas.microsoft.com/office/word/2010/wordprocessingShape" mc:Ignorable="w14 w15 w16se w16cid w16 w16cex w16sdtdh wp14">
+<w:endnotes xmlns:wpc="http://schemas.microsoft.com/office/word/2010/wordprocessingCanvas" xmlns:cx="http://schemas.microsoft.com/office/drawing/2014/chartex" xmlns:cx1="http://schemas.microsoft.com/office/drawing/2015/9/8/chartex" xmlns:cx2="http://schemas.microsoft.com/office/drawing/2015/10/21/chartex" xmlns:cx3="http://schemas.microsoft.com/office/drawing/2016/5/9/chartex" xmlns:cx4="http://schemas.microsoft.com/office/drawing/2016/5/10/chartex" xmlns:cx5="http://schemas.microsoft.com/office/drawing/2016/5/11/chartex" xmlns:cx6="http://schemas.microsoft.com/office/drawing/2016/5/12/chartex" xmlns:cx7="http://schemas.microsoft.com/office/drawing/2016/5/13/chartex" xmlns:cx8="http://schemas.microsoft.com/office/drawing/2016/5/14/chartex" xmlns:mc="http://schemas.openxmlformats.org/markup-compatibility/2006" xmlns:aink="http://schemas.microsoft.com/office/drawing/2016/ink" xmlns:am3d="http://schemas.microsoft.com/office/drawing/2017/model3d" xmlns:o="urn:schemas-microsoft-com:office:office" xmlns:oel="http://schemas.microsoft.com/office/2019/extlst" xmlns:r="http://schemas.openxmlformats.org/officeDocument/2006/relationships" xmlns:m="http://schemas.openxmlformats.org/officeDocument/2006/math" xmlns:v="urn:schemas-microsoft-com:vml" xmlns:wp14="http://schemas.microsoft.com/office/word/2010/wordprocessingDrawing" xmlns:wp="http://schemas.openxmlformats.org/drawingml/2006/wordprocessingDrawing" xmlns:w10="urn:schemas-microsoft-com:office:word" xmlns:w="http://schemas.openxmlformats.org/wordprocessingml/2006/main" xmlns:w14="http://schemas.microsoft.com/office/word/2010/wordml" xmlns:w15="http://schemas.microsoft.com/office/word/2012/wordml" xmlns:w16cex="http://schemas.microsoft.com/office/word/2018/wordml/cex" xmlns:w16cid="http://schemas.microsoft.com/office/word/2016/wordml/cid" xmlns:w16="http://schemas.microsoft.com/office/word/2018/wordml" xmlns:w16du="http://schemas.microsoft.com/office/word/2023/wordml/word16du" xmlns:w16sdtdh="http://schemas.microsoft.com/office/word/2020/wordml/sdtdatahash" xmlns:w16sdtfl="http://schemas.microsoft.com/office/word/2024/wordml/sdtformatlock" xmlns:w16se="http://schemas.microsoft.com/office/word/2015/wordml/symex" xmlns:wpg="http://schemas.microsoft.com/office/word/2010/wordprocessingGroup" xmlns:wpi="http://schemas.microsoft.com/office/word/2010/wordprocessingInk" xmlns:wne="http://schemas.microsoft.com/office/word/2006/wordml" xmlns:wps="http://schemas.microsoft.com/office/word/2010/wordprocessingShape" mc:Ignorable="w14 w15 w16se w16cid w16 w16cex w16sdtdh w16sdtfl w16du wp14">
   <w:endnote w:type="separator" w:id="-1">
     <w:p>
       <w:pPr>
@@ -169,7 +191,7 @@
 </file>
 
 <file path=word/footer1.xml><?xml version="1.0" encoding="utf-8"?>
-<w:ftr xmlns:wpc="http://schemas.microsoft.com/office/word/2010/wordprocessingCanvas" xmlns:cx="http://schemas.microsoft.com/office/drawing/2014/chartex" xmlns:cx1="http://schemas.microsoft.com/office/drawing/2015/9/8/chartex" xmlns:cx2="http://schemas.microsoft.com/office/drawing/2015/10/21/chartex" xmlns:cx3="http://schemas.microsoft.com/office/drawing/2016/5/9/chartex" xmlns:cx4="http://schemas.microsoft.com/office/drawing/2016/5/10/chartex" xmlns:cx5="http://schemas.microsoft.com/office/drawing/2016/5/11/chartex" xmlns:cx6="http://schemas.microsoft.com/office/drawing/2016/5/12/chartex" xmlns:cx7="http://schemas.microsoft.com/office/drawing/2016/5/13/chartex" xmlns:cx8="http://schemas.microsoft.com/office/drawing/2016/5/14/chartex" xmlns:mc="http://schemas.openxmlformats.org/markup-compatibility/2006" xmlns:aink="http://schemas.microsoft.com/office/drawing/2016/ink" xmlns:am3d="http://schemas.microsoft.com/office/drawing/2017/model3d" xmlns:o="urn:schemas-microsoft-com:office:office" xmlns:oel="http://schemas.microsoft.com/office/2019/extlst" xmlns:r="http://schemas.openxmlformats.org/officeDocument/2006/relationships" xmlns:m="http://schemas.openxmlformats.org/officeDocument/2006/math" xmlns:v="urn:schemas-microsoft-com:vml" xmlns:wp14="http://schemas.microsoft.com/office/word/2010/wordprocessingDrawing" xmlns:wp="http://schemas.openxmlformats.org/drawingml/2006/wordprocessingDrawing" xmlns:w10="urn:schemas-microsoft-com:office:word" xmlns:w="http://schemas.openxmlformats.org/wordprocessingml/2006/main" xmlns:w14="http://schemas.microsoft.com/office/word/2010/wordml" xmlns:w15="http://schemas.microsoft.com/office/word/2012/wordml" xmlns:w16cex="http://schemas.microsoft.com/office/word/2018/wordml/cex" xmlns:w16cid="http://schemas.microsoft.com/office/word/2016/wordml/cid" xmlns:w16="http://schemas.microsoft.com/office/word/2018/wordml" xmlns:w16sdtdh="http://schemas.microsoft.com/office/word/2020/wordml/sdtdatahash" xmlns:w16se="http://schemas.microsoft.com/office/word/2015/wordml/symex" xmlns:wpg="http://schemas.microsoft.com/office/word/2010/wordprocessingGroup" xmlns:wpi="http://schemas.microsoft.com/office/word/2010/wordprocessingInk" xmlns:wne="http://schemas.microsoft.com/office/word/2006/wordml" xmlns:wps="http://schemas.microsoft.com/office/word/2010/wordprocessingShape" mc:Ignorable="w14 w15 w16se w16cid w16 w16cex w16sdtdh wp14">
+<w:ftr xmlns:wpc="http://schemas.microsoft.com/office/word/2010/wordprocessingCanvas" xmlns:cx="http://schemas.microsoft.com/office/drawing/2014/chartex" xmlns:cx1="http://schemas.microsoft.com/office/drawing/2015/9/8/chartex" xmlns:cx2="http://schemas.microsoft.com/office/drawing/2015/10/21/chartex" xmlns:cx3="http://schemas.microsoft.com/office/drawing/2016/5/9/chartex" xmlns:cx4="http://schemas.microsoft.com/office/drawing/2016/5/10/chartex" xmlns:cx5="http://schemas.microsoft.com/office/drawing/2016/5/11/chartex" xmlns:cx6="http://schemas.microsoft.com/office/drawing/2016/5/12/chartex" xmlns:cx7="http://schemas.microsoft.com/office/drawing/2016/5/13/chartex" xmlns:cx8="http://schemas.microsoft.com/office/drawing/2016/5/14/chartex" xmlns:mc="http://schemas.openxmlformats.org/markup-compatibility/2006" xmlns:aink="http://schemas.microsoft.com/office/drawing/2016/ink" xmlns:am3d="http://schemas.microsoft.com/office/drawing/2017/model3d" xmlns:o="urn:schemas-microsoft-com:office:office" xmlns:oel="http://schemas.microsoft.com/office/2019/extlst" xmlns:r="http://schemas.openxmlformats.org/officeDocument/2006/relationships" xmlns:m="http://schemas.openxmlformats.org/officeDocument/2006/math" xmlns:v="urn:schemas-microsoft-com:vml" xmlns:wp14="http://schemas.microsoft.com/office/word/2010/wordprocessingDrawing" xmlns:wp="http://schemas.openxmlformats.org/drawingml/2006/wordprocessingDrawing" xmlns:w10="urn:schemas-microsoft-com:office:word" xmlns:w="http://schemas.openxmlformats.org/wordprocessingml/2006/main" xmlns:w14="http://schemas.microsoft.com/office/word/2010/wordml" xmlns:w15="http://schemas.microsoft.com/office/word/2012/wordml" xmlns:w16cex="http://schemas.microsoft.com/office/word/2018/wordml/cex" xmlns:w16cid="http://schemas.microsoft.com/office/word/2016/wordml/cid" xmlns:w16="http://schemas.microsoft.com/office/word/2018/wordml" xmlns:w16du="http://schemas.microsoft.com/office/word/2023/wordml/word16du" xmlns:w16sdtdh="http://schemas.microsoft.com/office/word/2020/wordml/sdtdatahash" xmlns:w16sdtfl="http://schemas.microsoft.com/office/word/2024/wordml/sdtformatlock" xmlns:w16se="http://schemas.microsoft.com/office/word/2015/wordml/symex" xmlns:wpg="http://schemas.microsoft.com/office/word/2010/wordprocessingGroup" xmlns:wpi="http://schemas.microsoft.com/office/word/2010/wordprocessingInk" xmlns:wne="http://schemas.microsoft.com/office/word/2006/wordml" xmlns:wps="http://schemas.microsoft.com/office/word/2010/wordprocessingShape" mc:Ignorable="w14 w15 w16se w16cid w16 w16cex w16sdtdh w16sdtfl w16du wp14">
   <w:p>
     <w:pPr>
       <w:pStyle w:val="Fuzeile"/>
@@ -179,7 +201,7 @@
 </file>
 
 <file path=word/footer2.xml><?xml version="1.0" encoding="utf-8"?>
-<w:ftr xmlns:wpc="http://schemas.microsoft.com/office/word/2010/wordprocessingCanvas" xmlns:cx="http://schemas.microsoft.com/office/drawing/2014/chartex" xmlns:cx1="http://schemas.microsoft.com/office/drawing/2015/9/8/chartex" xmlns:cx2="http://schemas.microsoft.com/office/drawing/2015/10/21/chartex" xmlns:cx3="http://schemas.microsoft.com/office/drawing/2016/5/9/chartex" xmlns:cx4="http://schemas.microsoft.com/office/drawing/2016/5/10/chartex" xmlns:cx5="http://schemas.microsoft.com/office/drawing/2016/5/11/chartex" xmlns:cx6="http://schemas.microsoft.com/office/drawing/2016/5/12/chartex" xmlns:cx7="http://schemas.microsoft.com/office/drawing/2016/5/13/chartex" xmlns:cx8="http://schemas.microsoft.com/office/drawing/2016/5/14/chartex" xmlns:mc="http://schemas.openxmlformats.org/markup-compatibility/2006" xmlns:aink="http://schemas.microsoft.com/office/drawing/2016/ink" xmlns:am3d="http://schemas.microsoft.com/office/drawing/2017/model3d" xmlns:o="urn:schemas-microsoft-com:office:office" xmlns:oel="http://schemas.microsoft.com/office/2019/extlst" xmlns:r="http://schemas.openxmlformats.org/officeDocument/2006/relationships" xmlns:m="http://schemas.openxmlformats.org/officeDocument/2006/math" xmlns:v="urn:schemas-microsoft-com:vml" xmlns:wp14="http://schemas.microsoft.com/office/word/2010/wordprocessingDrawing" xmlns:wp="http://schemas.openxmlformats.org/drawingml/2006/wordprocessingDrawing" xmlns:w10="urn:schemas-microsoft-com:office:word" xmlns:w="http://schemas.openxmlformats.org/wordprocessingml/2006/main" xmlns:w14="http://schemas.microsoft.com/office/word/2010/wordml" xmlns:w15="http://schemas.microsoft.com/office/word/2012/wordml" xmlns:w16cex="http://schemas.microsoft.com/office/word/2018/wordml/cex" xmlns:w16cid="http://schemas.microsoft.com/office/word/2016/wordml/cid" xmlns:w16="http://schemas.microsoft.com/office/word/2018/wordml" xmlns:w16sdtdh="http://schemas.microsoft.com/office/word/2020/wordml/sdtdatahash" xmlns:w16se="http://schemas.microsoft.com/office/word/2015/wordml/symex" xmlns:wpg="http://schemas.microsoft.com/office/word/2010/wordprocessingGroup" xmlns:wpi="http://schemas.microsoft.com/office/word/2010/wordprocessingInk" xmlns:wne="http://schemas.microsoft.com/office/word/2006/wordml" xmlns:wps="http://schemas.microsoft.com/office/word/2010/wordprocessingShape" mc:Ignorable="w14 w15 w16se w16cid w16 w16cex w16sdtdh wp14">
+<w:ftr xmlns:wpc="http://schemas.microsoft.com/office/word/2010/wordprocessingCanvas" xmlns:cx="http://schemas.microsoft.com/office/drawing/2014/chartex" xmlns:cx1="http://schemas.microsoft.com/office/drawing/2015/9/8/chartex" xmlns:cx2="http://schemas.microsoft.com/office/drawing/2015/10/21/chartex" xmlns:cx3="http://schemas.microsoft.com/office/drawing/2016/5/9/chartex" xmlns:cx4="http://schemas.microsoft.com/office/drawing/2016/5/10/chartex" xmlns:cx5="http://schemas.microsoft.com/office/drawing/2016/5/11/chartex" xmlns:cx6="http://schemas.microsoft.com/office/drawing/2016/5/12/chartex" xmlns:cx7="http://schemas.microsoft.com/office/drawing/2016/5/13/chartex" xmlns:cx8="http://schemas.microsoft.com/office/drawing/2016/5/14/chartex" xmlns:mc="http://schemas.openxmlformats.org/markup-compatibility/2006" xmlns:aink="http://schemas.microsoft.com/office/drawing/2016/ink" xmlns:am3d="http://schemas.microsoft.com/office/drawing/2017/model3d" xmlns:o="urn:schemas-microsoft-com:office:office" xmlns:oel="http://schemas.microsoft.com/office/2019/extlst" xmlns:r="http://schemas.openxmlformats.org/officeDocument/2006/relationships" xmlns:m="http://schemas.openxmlformats.org/officeDocument/2006/math" xmlns:v="urn:schemas-microsoft-com:vml" xmlns:wp14="http://schemas.microsoft.com/office/word/2010/wordprocessingDrawing" xmlns:wp="http://schemas.openxmlformats.org/drawingml/2006/wordprocessingDrawing" xmlns:w10="urn:schemas-microsoft-com:office:word" xmlns:w="http://schemas.openxmlformats.org/wordprocessingml/2006/main" xmlns:w14="http://schemas.microsoft.com/office/word/2010/wordml" xmlns:w15="http://schemas.microsoft.com/office/word/2012/wordml" xmlns:w16cex="http://schemas.microsoft.com/office/word/2018/wordml/cex" xmlns:w16cid="http://schemas.microsoft.com/office/word/2016/wordml/cid" xmlns:w16="http://schemas.microsoft.com/office/word/2018/wordml" xmlns:w16du="http://schemas.microsoft.com/office/word/2023/wordml/word16du" xmlns:w16sdtdh="http://schemas.microsoft.com/office/word/2020/wordml/sdtdatahash" xmlns:w16sdtfl="http://schemas.microsoft.com/office/word/2024/wordml/sdtformatlock" xmlns:w16se="http://schemas.microsoft.com/office/word/2015/wordml/symex" xmlns:wpg="http://schemas.microsoft.com/office/word/2010/wordprocessingGroup" xmlns:wpi="http://schemas.microsoft.com/office/word/2010/wordprocessingInk" xmlns:wne="http://schemas.microsoft.com/office/word/2006/wordml" xmlns:wps="http://schemas.microsoft.com/office/word/2010/wordprocessingShape" mc:Ignorable="w14 w15 w16se w16cid w16 w16cex w16sdtdh w16sdtfl w16du wp14">
   <w:sdt>
     <w:sdtPr>
       <w:id w:val="390308984"/>
@@ -221,7 +243,7 @@
 </file>
 
 <file path=word/footer3.xml><?xml version="1.0" encoding="utf-8"?>
-<w:ftr xmlns:wpc="http://schemas.microsoft.com/office/word/2010/wordprocessingCanvas" xmlns:cx="http://schemas.microsoft.com/office/drawing/2014/chartex" xmlns:cx1="http://schemas.microsoft.com/office/drawing/2015/9/8/chartex" xmlns:cx2="http://schemas.microsoft.com/office/drawing/2015/10/21/chartex" xmlns:cx3="http://schemas.microsoft.com/office/drawing/2016/5/9/chartex" xmlns:cx4="http://schemas.microsoft.com/office/drawing/2016/5/10/chartex" xmlns:cx5="http://schemas.microsoft.com/office/drawing/2016/5/11/chartex" xmlns:cx6="http://schemas.microsoft.com/office/drawing/2016/5/12/chartex" xmlns:cx7="http://schemas.microsoft.com/office/drawing/2016/5/13/chartex" xmlns:cx8="http://schemas.microsoft.com/office/drawing/2016/5/14/chartex" xmlns:mc="http://schemas.openxmlformats.org/markup-compatibility/2006" xmlns:aink="http://schemas.microsoft.com/office/drawing/2016/ink" xmlns:am3d="http://schemas.microsoft.com/office/drawing/2017/model3d" xmlns:o="urn:schemas-microsoft-com:office:office" xmlns:oel="http://schemas.microsoft.com/office/2019/extlst" xmlns:r="http://schemas.openxmlformats.org/officeDocument/2006/relationships" xmlns:m="http://schemas.openxmlformats.org/officeDocument/2006/math" xmlns:v="urn:schemas-microsoft-com:vml" xmlns:wp14="http://schemas.microsoft.com/office/word/2010/wordprocessingDrawing" xmlns:wp="http://schemas.openxmlformats.org/drawingml/2006/wordprocessingDrawing" xmlns:w10="urn:schemas-microsoft-com:office:word" xmlns:w="http://schemas.openxmlformats.org/wordprocessingml/2006/main" xmlns:w14="http://schemas.microsoft.com/office/word/2010/wordml" xmlns:w15="http://schemas.microsoft.com/office/word/2012/wordml" xmlns:w16cex="http://schemas.microsoft.com/office/word/2018/wordml/cex" xmlns:w16cid="http://schemas.microsoft.com/office/word/2016/wordml/cid" xmlns:w16="http://schemas.microsoft.com/office/word/2018/wordml" xmlns:w16sdtdh="http://schemas.microsoft.com/office/word/2020/wordml/sdtdatahash" xmlns:w16se="http://schemas.microsoft.com/office/word/2015/wordml/symex" xmlns:wpg="http://schemas.microsoft.com/office/word/2010/wordprocessingGroup" xmlns:wpi="http://schemas.microsoft.com/office/word/2010/wordprocessingInk" xmlns:wne="http://schemas.microsoft.com/office/word/2006/wordml" xmlns:wps="http://schemas.microsoft.com/office/word/2010/wordprocessingShape" mc:Ignorable="w14 w15 w16se w16cid w16 w16cex w16sdtdh wp14">
+<w:ftr xmlns:wpc="http://schemas.microsoft.com/office/word/2010/wordprocessingCanvas" xmlns:cx="http://schemas.microsoft.com/office/drawing/2014/chartex" xmlns:cx1="http://schemas.microsoft.com/office/drawing/2015/9/8/chartex" xmlns:cx2="http://schemas.microsoft.com/office/drawing/2015/10/21/chartex" xmlns:cx3="http://schemas.microsoft.com/office/drawing/2016/5/9/chartex" xmlns:cx4="http://schemas.microsoft.com/office/drawing/2016/5/10/chartex" xmlns:cx5="http://schemas.microsoft.com/office/drawing/2016/5/11/chartex" xmlns:cx6="http://schemas.microsoft.com/office/drawing/2016/5/12/chartex" xmlns:cx7="http://schemas.microsoft.com/office/drawing/2016/5/13/chartex" xmlns:cx8="http://schemas.microsoft.com/office/drawing/2016/5/14/chartex" xmlns:mc="http://schemas.openxmlformats.org/markup-compatibility/2006" xmlns:aink="http://schemas.microsoft.com/office/drawing/2016/ink" xmlns:am3d="http://schemas.microsoft.com/office/drawing/2017/model3d" xmlns:o="urn:schemas-microsoft-com:office:office" xmlns:oel="http://schemas.microsoft.com/office/2019/extlst" xmlns:r="http://schemas.openxmlformats.org/officeDocument/2006/relationships" xmlns:m="http://schemas.openxmlformats.org/officeDocument/2006/math" xmlns:v="urn:schemas-microsoft-com:vml" xmlns:wp14="http://schemas.microsoft.com/office/word/2010/wordprocessingDrawing" xmlns:wp="http://schemas.openxmlformats.org/drawingml/2006/wordprocessingDrawing" xmlns:w10="urn:schemas-microsoft-com:office:word" xmlns:w="http://schemas.openxmlformats.org/wordprocessingml/2006/main" xmlns:w14="http://schemas.microsoft.com/office/word/2010/wordml" xmlns:w15="http://schemas.microsoft.com/office/word/2012/wordml" xmlns:w16cex="http://schemas.microsoft.com/office/word/2018/wordml/cex" xmlns:w16cid="http://schemas.microsoft.com/office/word/2016/wordml/cid" xmlns:w16="http://schemas.microsoft.com/office/word/2018/wordml" xmlns:w16du="http://schemas.microsoft.com/office/word/2023/wordml/word16du" xmlns:w16sdtdh="http://schemas.microsoft.com/office/word/2020/wordml/sdtdatahash" xmlns:w16sdtfl="http://schemas.microsoft.com/office/word/2024/wordml/sdtformatlock" xmlns:w16se="http://schemas.microsoft.com/office/word/2015/wordml/symex" xmlns:wpg="http://schemas.microsoft.com/office/word/2010/wordprocessingGroup" xmlns:wpi="http://schemas.microsoft.com/office/word/2010/wordprocessingInk" xmlns:wne="http://schemas.microsoft.com/office/word/2006/wordml" xmlns:wps="http://schemas.microsoft.com/office/word/2010/wordprocessingShape" mc:Ignorable="w14 w15 w16se w16cid w16 w16cex w16sdtdh w16sdtfl w16du wp14">
   <w:sdt>
     <w:sdtPr>
       <w:id w:val="-1734924366"/>
@@ -263,7 +285,7 @@
 </file>
 
 <file path=word/footnotes.xml><?xml version="1.0" encoding="utf-8"?>
-<w:footnotes xmlns:wpc="http://schemas.microsoft.com/office/word/2010/wordprocessingCanvas" xmlns:cx="http://schemas.microsoft.com/office/drawing/2014/chartex" xmlns:cx1="http://schemas.microsoft.com/office/drawing/2015/9/8/chartex" xmlns:cx2="http://schemas.microsoft.com/office/drawing/2015/10/21/chartex" xmlns:cx3="http://schemas.microsoft.com/office/drawing/2016/5/9/chartex" xmlns:cx4="http://schemas.microsoft.com/office/drawing/2016/5/10/chartex" xmlns:cx5="http://schemas.microsoft.com/office/drawing/2016/5/11/chartex" xmlns:cx6="http://schemas.microsoft.com/office/drawing/2016/5/12/chartex" xmlns:cx7="http://schemas.microsoft.com/office/drawing/2016/5/13/chartex" xmlns:cx8="http://schemas.microsoft.com/office/drawing/2016/5/14/chartex" xmlns:mc="http://schemas.openxmlformats.org/markup-compatibility/2006" xmlns:aink="http://schemas.microsoft.com/office/drawing/2016/ink" xmlns:am3d="http://schemas.microsoft.com/office/drawing/2017/model3d" xmlns:o="urn:schemas-microsoft-com:office:office" xmlns:oel="http://schemas.microsoft.com/office/2019/extlst" xmlns:r="http://schemas.openxmlformats.org/officeDocument/2006/relationships" xmlns:m="http://schemas.openxmlformats.org/officeDocument/2006/math" xmlns:v="urn:schemas-microsoft-com:vml" xmlns:wp14="http://schemas.microsoft.com/office/word/2010/wordprocessingDrawing" xmlns:wp="http://schemas.openxmlformats.org/drawingml/2006/wordprocessingDrawing" xmlns:w10="urn:schemas-microsoft-com:office:word" xmlns:w="http://schemas.openxmlformats.org/wordprocessingml/2006/main" xmlns:w14="http://schemas.microsoft.com/office/word/2010/wordml" xmlns:w15="http://schemas.microsoft.com/office/word/2012/wordml" xmlns:w16cex="http://schemas.microsoft.com/office/word/2018/wordml/cex" xmlns:w16cid="http://schemas.microsoft.com/office/word/2016/wordml/cid" xmlns:w16="http://schemas.microsoft.com/office/word/2018/wordml" xmlns:w16sdtdh="http://schemas.microsoft.com/office/word/2020/wordml/sdtdatahash" xmlns:w16se="http://schemas.microsoft.com/office/word/2015/wordml/symex" xmlns:wpg="http://schemas.microsoft.com/office/word/2010/wordprocessingGroup" xmlns:wpi="http://schemas.microsoft.com/office/word/2010/wordprocessingInk" xmlns:wne="http://schemas.microsoft.com/office/word/2006/wordml" xmlns:wps="http://schemas.microsoft.com/office/word/2010/wordprocessingShape" mc:Ignorable="w14 w15 w16se w16cid w16 w16cex w16sdtdh wp14">
+<w:footnotes xmlns:wpc="http://schemas.microsoft.com/office/word/2010/wordprocessingCanvas" xmlns:cx="http://schemas.microsoft.com/office/drawing/2014/chartex" xmlns:cx1="http://schemas.microsoft.com/office/drawing/2015/9/8/chartex" xmlns:cx2="http://schemas.microsoft.com/office/drawing/2015/10/21/chartex" xmlns:cx3="http://schemas.microsoft.com/office/drawing/2016/5/9/chartex" xmlns:cx4="http://schemas.microsoft.com/office/drawing/2016/5/10/chartex" xmlns:cx5="http://schemas.microsoft.com/office/drawing/2016/5/11/chartex" xmlns:cx6="http://schemas.microsoft.com/office/drawing/2016/5/12/chartex" xmlns:cx7="http://schemas.microsoft.com/office/drawing/2016/5/13/chartex" xmlns:cx8="http://schemas.microsoft.com/office/drawing/2016/5/14/chartex" xmlns:mc="http://schemas.openxmlformats.org/markup-compatibility/2006" xmlns:aink="http://schemas.microsoft.com/office/drawing/2016/ink" xmlns:am3d="http://schemas.microsoft.com/office/drawing/2017/model3d" xmlns:o="urn:schemas-microsoft-com:office:office" xmlns:oel="http://schemas.microsoft.com/office/2019/extlst" xmlns:r="http://schemas.openxmlformats.org/officeDocument/2006/relationships" xmlns:m="http://schemas.openxmlformats.org/officeDocument/2006/math" xmlns:v="urn:schemas-microsoft-com:vml" xmlns:wp14="http://schemas.microsoft.com/office/word/2010/wordprocessingDrawing" xmlns:wp="http://schemas.openxmlformats.org/drawingml/2006/wordprocessingDrawing" xmlns:w10="urn:schemas-microsoft-com:office:word" xmlns:w="http://schemas.openxmlformats.org/wordprocessingml/2006/main" xmlns:w14="http://schemas.microsoft.com/office/word/2010/wordml" xmlns:w15="http://schemas.microsoft.com/office/word/2012/wordml" xmlns:w16cex="http://schemas.microsoft.com/office/word/2018/wordml/cex" xmlns:w16cid="http://schemas.microsoft.com/office/word/2016/wordml/cid" xmlns:w16="http://schemas.microsoft.com/office/word/2018/wordml" xmlns:w16du="http://schemas.microsoft.com/office/word/2023/wordml/word16du" xmlns:w16sdtdh="http://schemas.microsoft.com/office/word/2020/wordml/sdtdatahash" xmlns:w16sdtfl="http://schemas.microsoft.com/office/word/2024/wordml/sdtformatlock" xmlns:w16se="http://schemas.microsoft.com/office/word/2015/wordml/symex" xmlns:wpg="http://schemas.microsoft.com/office/word/2010/wordprocessingGroup" xmlns:wpi="http://schemas.microsoft.com/office/word/2010/wordprocessingInk" xmlns:wne="http://schemas.microsoft.com/office/word/2006/wordml" xmlns:wps="http://schemas.microsoft.com/office/word/2010/wordprocessingShape" mc:Ignorable="w14 w15 w16se w16cid w16 w16cex w16sdtdh w16sdtfl w16du wp14">
   <w:footnote w:type="separator" w:id="-1">
     <w:p>
       <w:r>
@@ -282,7 +304,7 @@
 </file>
 
 <file path=word/header1.xml><?xml version="1.0" encoding="utf-8"?>
-<w:hdr xmlns:wpc="http://schemas.microsoft.com/office/word/2010/wordprocessingCanvas" xmlns:cx="http://schemas.microsoft.com/office/drawing/2014/chartex" xmlns:cx1="http://schemas.microsoft.com/office/drawing/2015/9/8/chartex" xmlns:cx2="http://schemas.microsoft.com/office/drawing/2015/10/21/chartex" xmlns:cx3="http://schemas.microsoft.com/office/drawing/2016/5/9/chartex" xmlns:cx4="http://schemas.microsoft.com/office/drawing/2016/5/10/chartex" xmlns:cx5="http://schemas.microsoft.com/office/drawing/2016/5/11/chartex" xmlns:cx6="http://schemas.microsoft.com/office/drawing/2016/5/12/chartex" xmlns:cx7="http://schemas.microsoft.com/office/drawing/2016/5/13/chartex" xmlns:cx8="http://schemas.microsoft.com/office/drawing/2016/5/14/chartex" xmlns:mc="http://schemas.openxmlformats.org/markup-compatibility/2006" xmlns:aink="http://schemas.microsoft.com/office/drawing/2016/ink" xmlns:am3d="http://schemas.microsoft.com/office/drawing/2017/model3d" xmlns:o="urn:schemas-microsoft-com:office:office" xmlns:oel="http://schemas.microsoft.com/office/2019/extlst" xmlns:r="http://schemas.openxmlformats.org/officeDocument/2006/relationships" xmlns:m="http://schemas.openxmlformats.org/officeDocument/2006/math" xmlns:v="urn:schemas-microsoft-com:vml" xmlns:wp14="http://schemas.microsoft.com/office/word/2010/wordprocessingDrawing" xmlns:wp="http://schemas.openxmlformats.org/drawingml/2006/wordprocessingDrawing" xmlns:w10="urn:schemas-microsoft-com:office:word" xmlns:w="http://schemas.openxmlformats.org/wordprocessingml/2006/main" xmlns:w14="http://schemas.microsoft.com/office/word/2010/wordml" xmlns:w15="http://schemas.microsoft.com/office/word/2012/wordml" xmlns:w16cex="http://schemas.microsoft.com/office/word/2018/wordml/cex" xmlns:w16cid="http://schemas.microsoft.com/office/word/2016/wordml/cid" xmlns:w16="http://schemas.microsoft.com/office/word/2018/wordml" xmlns:w16sdtdh="http://schemas.microsoft.com/office/word/2020/wordml/sdtdatahash" xmlns:w16se="http://schemas.microsoft.com/office/word/2015/wordml/symex" xmlns:wpg="http://schemas.microsoft.com/office/word/2010/wordprocessingGroup" xmlns:wpi="http://schemas.microsoft.com/office/word/2010/wordprocessingInk" xmlns:wne="http://schemas.microsoft.com/office/word/2006/wordml" xmlns:wps="http://schemas.microsoft.com/office/word/2010/wordprocessingShape" mc:Ignorable="w14 w15 w16se w16cid w16 w16cex w16sdtdh wp14">
+<w:hdr xmlns:wpc="http://schemas.microsoft.com/office/word/2010/wordprocessingCanvas" xmlns:cx="http://schemas.microsoft.com/office/drawing/2014/chartex" xmlns:cx1="http://schemas.microsoft.com/office/drawing/2015/9/8/chartex" xmlns:cx2="http://schemas.microsoft.com/office/drawing/2015/10/21/chartex" xmlns:cx3="http://schemas.microsoft.com/office/drawing/2016/5/9/chartex" xmlns:cx4="http://schemas.microsoft.com/office/drawing/2016/5/10/chartex" xmlns:cx5="http://schemas.microsoft.com/office/drawing/2016/5/11/chartex" xmlns:cx6="http://schemas.microsoft.com/office/drawing/2016/5/12/chartex" xmlns:cx7="http://schemas.microsoft.com/office/drawing/2016/5/13/chartex" xmlns:cx8="http://schemas.microsoft.com/office/drawing/2016/5/14/chartex" xmlns:mc="http://schemas.openxmlformats.org/markup-compatibility/2006" xmlns:aink="http://schemas.microsoft.com/office/drawing/2016/ink" xmlns:am3d="http://schemas.microsoft.com/office/drawing/2017/model3d" xmlns:o="urn:schemas-microsoft-com:office:office" xmlns:oel="http://schemas.microsoft.com/office/2019/extlst" xmlns:r="http://schemas.openxmlformats.org/officeDocument/2006/relationships" xmlns:m="http://schemas.openxmlformats.org/officeDocument/2006/math" xmlns:v="urn:schemas-microsoft-com:vml" xmlns:wp14="http://schemas.microsoft.com/office/word/2010/wordprocessingDrawing" xmlns:wp="http://schemas.openxmlformats.org/drawingml/2006/wordprocessingDrawing" xmlns:w10="urn:schemas-microsoft-com:office:word" xmlns:w="http://schemas.openxmlformats.org/wordprocessingml/2006/main" xmlns:w14="http://schemas.microsoft.com/office/word/2010/wordml" xmlns:w15="http://schemas.microsoft.com/office/word/2012/wordml" xmlns:w16cex="http://schemas.microsoft.com/office/word/2018/wordml/cex" xmlns:w16cid="http://schemas.microsoft.com/office/word/2016/wordml/cid" xmlns:w16="http://schemas.microsoft.com/office/word/2018/wordml" xmlns:w16du="http://schemas.microsoft.com/office/word/2023/wordml/word16du" xmlns:w16sdtdh="http://schemas.microsoft.com/office/word/2020/wordml/sdtdatahash" xmlns:w16sdtfl="http://schemas.microsoft.com/office/word/2024/wordml/sdtformatlock" xmlns:w16se="http://schemas.microsoft.com/office/word/2015/wordml/symex" xmlns:wpg="http://schemas.microsoft.com/office/word/2010/wordprocessingGroup" xmlns:wpi="http://schemas.microsoft.com/office/word/2010/wordprocessingInk" xmlns:wne="http://schemas.microsoft.com/office/word/2006/wordml" xmlns:wps="http://schemas.microsoft.com/office/word/2010/wordprocessingShape" mc:Ignorable="w14 w15 w16se w16cid w16 w16cex w16sdtdh w16sdtfl w16du wp14">
   <w:p>
     <w:pPr>
       <w:pStyle w:val="Kopfzeile"/>
@@ -292,7 +314,7 @@
 </file>
 
 <file path=word/header2.xml><?xml version="1.0" encoding="utf-8"?>
-<w:hdr xmlns:wpc="http://schemas.microsoft.com/office/word/2010/wordprocessingCanvas" xmlns:cx="http://schemas.microsoft.com/office/drawing/2014/chartex" xmlns:cx1="http://schemas.microsoft.com/office/drawing/2015/9/8/chartex" xmlns:cx2="http://schemas.microsoft.com/office/drawing/2015/10/21/chartex" xmlns:cx3="http://schemas.microsoft.com/office/drawing/2016/5/9/chartex" xmlns:cx4="http://schemas.microsoft.com/office/drawing/2016/5/10/chartex" xmlns:cx5="http://schemas.microsoft.com/office/drawing/2016/5/11/chartex" xmlns:cx6="http://schemas.microsoft.com/office/drawing/2016/5/12/chartex" xmlns:cx7="http://schemas.microsoft.com/office/drawing/2016/5/13/chartex" xmlns:cx8="http://schemas.microsoft.com/office/drawing/2016/5/14/chartex" xmlns:mc="http://schemas.openxmlformats.org/markup-compatibility/2006" xmlns:aink="http://schemas.microsoft.com/office/drawing/2016/ink" xmlns:am3d="http://schemas.microsoft.com/office/drawing/2017/model3d" xmlns:o="urn:schemas-microsoft-com:office:office" xmlns:oel="http://schemas.microsoft.com/office/2019/extlst" xmlns:r="http://schemas.openxmlformats.org/officeDocument/2006/relationships" xmlns:m="http://schemas.openxmlformats.org/officeDocument/2006/math" xmlns:v="urn:schemas-microsoft-com:vml" xmlns:wp14="http://schemas.microsoft.com/office/word/2010/wordprocessingDrawing" xmlns:wp="http://schemas.openxmlformats.org/drawingml/2006/wordprocessingDrawing" xmlns:w10="urn:schemas-microsoft-com:office:word" xmlns:w="http://schemas.openxmlformats.org/wordprocessingml/2006/main" xmlns:w14="http://schemas.microsoft.com/office/word/2010/wordml" xmlns:w15="http://schemas.microsoft.com/office/word/2012/wordml" xmlns:w16cex="http://schemas.microsoft.com/office/word/2018/wordml/cex" xmlns:w16cid="http://schemas.microsoft.com/office/word/2016/wordml/cid" xmlns:w16="http://schemas.microsoft.com/office/word/2018/wordml" xmlns:w16sdtdh="http://schemas.microsoft.com/office/word/2020/wordml/sdtdatahash" xmlns:w16se="http://schemas.microsoft.com/office/word/2015/wordml/symex" xmlns:wpg="http://schemas.microsoft.com/office/word/2010/wordprocessingGroup" xmlns:wpi="http://schemas.microsoft.com/office/word/2010/wordprocessingInk" xmlns:wne="http://schemas.microsoft.com/office/word/2006/wordml" xmlns:wps="http://schemas.microsoft.com/office/word/2010/wordprocessingShape" mc:Ignorable="w14 w15 w16se w16cid w16 w16cex w16sdtdh wp14">
+<w:hdr xmlns:wpc="http://schemas.microsoft.com/office/word/2010/wordprocessingCanvas" xmlns:cx="http://schemas.microsoft.com/office/drawing/2014/chartex" xmlns:cx1="http://schemas.microsoft.com/office/drawing/2015/9/8/chartex" xmlns:cx2="http://schemas.microsoft.com/office/drawing/2015/10/21/chartex" xmlns:cx3="http://schemas.microsoft.com/office/drawing/2016/5/9/chartex" xmlns:cx4="http://schemas.microsoft.com/office/drawing/2016/5/10/chartex" xmlns:cx5="http://schemas.microsoft.com/office/drawing/2016/5/11/chartex" xmlns:cx6="http://schemas.microsoft.com/office/drawing/2016/5/12/chartex" xmlns:cx7="http://schemas.microsoft.com/office/drawing/2016/5/13/chartex" xmlns:cx8="http://schemas.microsoft.com/office/drawing/2016/5/14/chartex" xmlns:mc="http://schemas.openxmlformats.org/markup-compatibility/2006" xmlns:aink="http://schemas.microsoft.com/office/drawing/2016/ink" xmlns:am3d="http://schemas.microsoft.com/office/drawing/2017/model3d" xmlns:o="urn:schemas-microsoft-com:office:office" xmlns:oel="http://schemas.microsoft.com/office/2019/extlst" xmlns:r="http://schemas.openxmlformats.org/officeDocument/2006/relationships" xmlns:m="http://schemas.openxmlformats.org/officeDocument/2006/math" xmlns:v="urn:schemas-microsoft-com:vml" xmlns:wp14="http://schemas.microsoft.com/office/word/2010/wordprocessingDrawing" xmlns:wp="http://schemas.openxmlformats.org/drawingml/2006/wordprocessingDrawing" xmlns:w10="urn:schemas-microsoft-com:office:word" xmlns:w="http://schemas.openxmlformats.org/wordprocessingml/2006/main" xmlns:w14="http://schemas.microsoft.com/office/word/2010/wordml" xmlns:w15="http://schemas.microsoft.com/office/word/2012/wordml" xmlns:w16cex="http://schemas.microsoft.com/office/word/2018/wordml/cex" xmlns:w16cid="http://schemas.microsoft.com/office/word/2016/wordml/cid" xmlns:w16="http://schemas.microsoft.com/office/word/2018/wordml" xmlns:w16du="http://schemas.microsoft.com/office/word/2023/wordml/word16du" xmlns:w16sdtdh="http://schemas.microsoft.com/office/word/2020/wordml/sdtdatahash" xmlns:w16sdtfl="http://schemas.microsoft.com/office/word/2024/wordml/sdtformatlock" xmlns:w16se="http://schemas.microsoft.com/office/word/2015/wordml/symex" xmlns:wpg="http://schemas.microsoft.com/office/word/2010/wordprocessingGroup" xmlns:wpi="http://schemas.microsoft.com/office/word/2010/wordprocessingInk" xmlns:wne="http://schemas.microsoft.com/office/word/2006/wordml" xmlns:wps="http://schemas.microsoft.com/office/word/2010/wordprocessingShape" mc:Ignorable="w14 w15 w16se w16cid w16 w16cex w16sdtdh w16sdtfl w16du wp14">
   <w:p>
     <w:pPr>
       <w:pStyle w:val="Kopfzeile"/>
@@ -314,7 +336,7 @@
 </file>
 
 <file path=word/header3.xml><?xml version="1.0" encoding="utf-8"?>
-<w:hdr xmlns:wpc="http://schemas.microsoft.com/office/word/2010/wordprocessingCanvas" xmlns:cx="http://schemas.microsoft.com/office/drawing/2014/chartex" xmlns:cx1="http://schemas.microsoft.com/office/drawing/2015/9/8/chartex" xmlns:cx2="http://schemas.microsoft.com/office/drawing/2015/10/21/chartex" xmlns:cx3="http://schemas.microsoft.com/office/drawing/2016/5/9/chartex" xmlns:cx4="http://schemas.microsoft.com/office/drawing/2016/5/10/chartex" xmlns:cx5="http://schemas.microsoft.com/office/drawing/2016/5/11/chartex" xmlns:cx6="http://schemas.microsoft.com/office/drawing/2016/5/12/chartex" xmlns:cx7="http://schemas.microsoft.com/office/drawing/2016/5/13/chartex" xmlns:cx8="http://schemas.microsoft.com/office/drawing/2016/5/14/chartex" xmlns:mc="http://schemas.openxmlformats.org/markup-compatibility/2006" xmlns:aink="http://schemas.microsoft.com/office/drawing/2016/ink" xmlns:am3d="http://schemas.microsoft.com/office/drawing/2017/model3d" xmlns:o="urn:schemas-microsoft-com:office:office" xmlns:oel="http://schemas.microsoft.com/office/2019/extlst" xmlns:r="http://schemas.openxmlformats.org/officeDocument/2006/relationships" xmlns:m="http://schemas.openxmlformats.org/officeDocument/2006/math" xmlns:v="urn:schemas-microsoft-com:vml" xmlns:wp14="http://schemas.microsoft.com/office/word/2010/wordprocessingDrawing" xmlns:wp="http://schemas.openxmlformats.org/drawingml/2006/wordprocessingDrawing" xmlns:w10="urn:schemas-microsoft-com:office:word" xmlns:w="http://schemas.openxmlformats.org/wordprocessingml/2006/main" xmlns:w14="http://schemas.microsoft.com/office/word/2010/wordml" xmlns:w15="http://schemas.microsoft.com/office/word/2012/wordml" xmlns:w16cex="http://schemas.microsoft.com/office/word/2018/wordml/cex" xmlns:w16cid="http://schemas.microsoft.com/office/word/2016/wordml/cid" xmlns:w16="http://schemas.microsoft.com/office/word/2018/wordml" xmlns:w16sdtdh="http://schemas.microsoft.com/office/word/2020/wordml/sdtdatahash" xmlns:w16se="http://schemas.microsoft.com/office/word/2015/wordml/symex" xmlns:wpg="http://schemas.microsoft.com/office/word/2010/wordprocessingGroup" xmlns:wpi="http://schemas.microsoft.com/office/word/2010/wordprocessingInk" xmlns:wne="http://schemas.microsoft.com/office/word/2006/wordml" xmlns:wps="http://schemas.microsoft.com/office/word/2010/wordprocessingShape" mc:Ignorable="w14 w15 w16se w16cid w16 w16cex w16sdtdh wp14">
+<w:hdr xmlns:wpc="http://schemas.microsoft.com/office/word/2010/wordprocessingCanvas" xmlns:cx="http://schemas.microsoft.com/office/drawing/2014/chartex" xmlns:cx1="http://schemas.microsoft.com/office/drawing/2015/9/8/chartex" xmlns:cx2="http://schemas.microsoft.com/office/drawing/2015/10/21/chartex" xmlns:cx3="http://schemas.microsoft.com/office/drawing/2016/5/9/chartex" xmlns:cx4="http://schemas.microsoft.com/office/drawing/2016/5/10/chartex" xmlns:cx5="http://schemas.microsoft.com/office/drawing/2016/5/11/chartex" xmlns:cx6="http://schemas.microsoft.com/office/drawing/2016/5/12/chartex" xmlns:cx7="http://schemas.microsoft.com/office/drawing/2016/5/13/chartex" xmlns:cx8="http://schemas.microsoft.com/office/drawing/2016/5/14/chartex" xmlns:mc="http://schemas.openxmlformats.org/markup-compatibility/2006" xmlns:aink="http://schemas.microsoft.com/office/drawing/2016/ink" xmlns:am3d="http://schemas.microsoft.com/office/drawing/2017/model3d" xmlns:o="urn:schemas-microsoft-com:office:office" xmlns:oel="http://schemas.microsoft.com/office/2019/extlst" xmlns:r="http://schemas.openxmlformats.org/officeDocument/2006/relationships" xmlns:m="http://schemas.openxmlformats.org/officeDocument/2006/math" xmlns:v="urn:schemas-microsoft-com:vml" xmlns:wp14="http://schemas.microsoft.com/office/word/2010/wordprocessingDrawing" xmlns:wp="http://schemas.openxmlformats.org/drawingml/2006/wordprocessingDrawing" xmlns:w10="urn:schemas-microsoft-com:office:word" xmlns:w="http://schemas.openxmlformats.org/wordprocessingml/2006/main" xmlns:w14="http://schemas.microsoft.com/office/word/2010/wordml" xmlns:w15="http://schemas.microsoft.com/office/word/2012/wordml" xmlns:w16cex="http://schemas.microsoft.com/office/word/2018/wordml/cex" xmlns:w16cid="http://schemas.microsoft.com/office/word/2016/wordml/cid" xmlns:w16="http://schemas.microsoft.com/office/word/2018/wordml" xmlns:w16du="http://schemas.microsoft.com/office/word/2023/wordml/word16du" xmlns:w16sdtdh="http://schemas.microsoft.com/office/word/2020/wordml/sdtdatahash" xmlns:w16sdtfl="http://schemas.microsoft.com/office/word/2024/wordml/sdtformatlock" xmlns:w16se="http://schemas.microsoft.com/office/word/2015/wordml/symex" xmlns:wpg="http://schemas.microsoft.com/office/word/2010/wordprocessingGroup" xmlns:wpi="http://schemas.microsoft.com/office/word/2010/wordprocessingInk" xmlns:wne="http://schemas.microsoft.com/office/word/2006/wordml" xmlns:wps="http://schemas.microsoft.com/office/word/2010/wordprocessingShape" mc:Ignorable="w14 w15 w16se w16cid w16 w16cex w16sdtdh w16sdtfl w16du wp14">
   <w:p>
     <w:pPr>
       <w:pStyle w:val="Kopfzeile"/>
@@ -425,7 +447,7 @@
 </file>
 
 <file path=word/numbering.xml><?xml version="1.0" encoding="utf-8"?>
-<w:numbering xmlns:wpc="http://schemas.microsoft.com/office/word/2010/wordprocessingCanvas" xmlns:cx="http://schemas.microsoft.com/office/drawing/2014/chartex" xmlns:cx1="http://schemas.microsoft.com/office/drawing/2015/9/8/chartex" xmlns:cx2="http://schemas.microsoft.com/office/drawing/2015/10/21/chartex" xmlns:cx3="http://schemas.microsoft.com/office/drawing/2016/5/9/chartex" xmlns:cx4="http://schemas.microsoft.com/office/drawing/2016/5/10/chartex" xmlns:cx5="http://schemas.microsoft.com/office/drawing/2016/5/11/chartex" xmlns:cx6="http://schemas.microsoft.com/office/drawing/2016/5/12/chartex" xmlns:cx7="http://schemas.microsoft.com/office/drawing/2016/5/13/chartex" xmlns:cx8="http://schemas.microsoft.com/office/drawing/2016/5/14/chartex" xmlns:mc="http://schemas.openxmlformats.org/markup-compatibility/2006" xmlns:aink="http://schemas.microsoft.com/office/drawing/2016/ink" xmlns:am3d="http://schemas.microsoft.com/office/drawing/2017/model3d" xmlns:o="urn:schemas-microsoft-com:office:office" xmlns:oel="http://schemas.microsoft.com/office/2019/extlst" xmlns:r="http://schemas.openxmlformats.org/officeDocument/2006/relationships" xmlns:m="http://schemas.openxmlformats.org/officeDocument/2006/math" xmlns:v="urn:schemas-microsoft-com:vml" xmlns:wp14="http://schemas.microsoft.com/office/word/2010/wordprocessingDrawing" xmlns:wp="http://schemas.openxmlformats.org/drawingml/2006/wordprocessingDrawing" xmlns:w10="urn:schemas-microsoft-com:office:word" xmlns:w="http://schemas.openxmlformats.org/wordprocessingml/2006/main" xmlns:w14="http://schemas.microsoft.com/office/word/2010/wordml" xmlns:w15="http://schemas.microsoft.com/office/word/2012/wordml" xmlns:w16cex="http://schemas.microsoft.com/office/word/2018/wordml/cex" xmlns:w16cid="http://schemas.microsoft.com/office/word/2016/wordml/cid" xmlns:w16="http://schemas.microsoft.com/office/word/2018/wordml" xmlns:w16sdtdh="http://schemas.microsoft.com/office/word/2020/wordml/sdtdatahash" xmlns:w16se="http://schemas.microsoft.com/office/word/2015/wordml/symex" xmlns:wpg="http://schemas.microsoft.com/office/word/2010/wordprocessingGroup" xmlns:wpi="http://schemas.microsoft.com/office/word/2010/wordprocessingInk" xmlns:wne="http://schemas.microsoft.com/office/word/2006/wordml" xmlns:wps="http://schemas.microsoft.com/office/word/2010/wordprocessingShape" mc:Ignorable="w14 w15 w16se w16cid w16 w16cex w16sdtdh wp14">
+<w:numbering xmlns:wpc="http://schemas.microsoft.com/office/word/2010/wordprocessingCanvas" xmlns:cx="http://schemas.microsoft.com/office/drawing/2014/chartex" xmlns:cx1="http://schemas.microsoft.com/office/drawing/2015/9/8/chartex" xmlns:cx2="http://schemas.microsoft.com/office/drawing/2015/10/21/chartex" xmlns:cx3="http://schemas.microsoft.com/office/drawing/2016/5/9/chartex" xmlns:cx4="http://schemas.microsoft.com/office/drawing/2016/5/10/chartex" xmlns:cx5="http://schemas.microsoft.com/office/drawing/2016/5/11/chartex" xmlns:cx6="http://schemas.microsoft.com/office/drawing/2016/5/12/chartex" xmlns:cx7="http://schemas.microsoft.com/office/drawing/2016/5/13/chartex" xmlns:cx8="http://schemas.microsoft.com/office/drawing/2016/5/14/chartex" xmlns:mc="http://schemas.openxmlformats.org/markup-compatibility/2006" xmlns:aink="http://schemas.microsoft.com/office/drawing/2016/ink" xmlns:am3d="http://schemas.microsoft.com/office/drawing/2017/model3d" xmlns:o="urn:schemas-microsoft-com:office:office" xmlns:oel="http://schemas.microsoft.com/office/2019/extlst" xmlns:r="http://schemas.openxmlformats.org/officeDocument/2006/relationships" xmlns:m="http://schemas.openxmlformats.org/officeDocument/2006/math" xmlns:v="urn:schemas-microsoft-com:vml" xmlns:wp14="http://schemas.microsoft.com/office/word/2010/wordprocessingDrawing" xmlns:wp="http://schemas.openxmlformats.org/drawingml/2006/wordprocessingDrawing" xmlns:w10="urn:schemas-microsoft-com:office:word" xmlns:w="http://schemas.openxmlformats.org/wordprocessingml/2006/main" xmlns:w14="http://schemas.microsoft.com/office/word/2010/wordml" xmlns:w15="http://schemas.microsoft.com/office/word/2012/wordml" xmlns:w16cex="http://schemas.microsoft.com/office/word/2018/wordml/cex" xmlns:w16cid="http://schemas.microsoft.com/office/word/2016/wordml/cid" xmlns:w16="http://schemas.microsoft.com/office/word/2018/wordml" xmlns:w16du="http://schemas.microsoft.com/office/word/2023/wordml/word16du" xmlns:w16sdtdh="http://schemas.microsoft.com/office/word/2020/wordml/sdtdatahash" xmlns:w16sdtfl="http://schemas.microsoft.com/office/word/2024/wordml/sdtformatlock" xmlns:w16se="http://schemas.microsoft.com/office/word/2015/wordml/symex" xmlns:wpg="http://schemas.microsoft.com/office/word/2010/wordprocessingGroup" xmlns:wpi="http://schemas.microsoft.com/office/word/2010/wordprocessingInk" xmlns:wne="http://schemas.microsoft.com/office/word/2006/wordml" xmlns:wps="http://schemas.microsoft.com/office/word/2010/wordprocessingShape" mc:Ignorable="w14 w15 w16se w16cid w16 w16cex w16sdtdh w16sdtfl w16du wp14">
   <w:abstractNum w:abstractNumId="0" w15:restartNumberingAfterBreak="0">
     <w:nsid w:val="FFFFFF7C"/>
     <w:multiLevelType w:val="singleLevel"/>
@@ -1407,7 +1429,7 @@
 </file>
 
 <file path=word/styles.xml><?xml version="1.0" encoding="utf-8"?>
-<w:styles xmlns:mc="http://schemas.openxmlformats.org/markup-compatibility/2006" xmlns:r="http://schemas.openxmlformats.org/officeDocument/2006/relationships" xmlns:w="http://schemas.openxmlformats.org/wordprocessingml/2006/main" xmlns:w14="http://schemas.microsoft.com/office/word/2010/wordml" xmlns:w15="http://schemas.microsoft.com/office/word/2012/wordml" xmlns:w16cex="http://schemas.microsoft.com/office/word/2018/wordml/cex" xmlns:w16cid="http://schemas.microsoft.com/office/word/2016/wordml/cid" xmlns:w16="http://schemas.microsoft.com/office/word/2018/wordml" xmlns:w16sdtdh="http://schemas.microsoft.com/office/word/2020/wordml/sdtdatahash" xmlns:w16se="http://schemas.microsoft.com/office/word/2015/wordml/symex" mc:Ignorable="w14 w15 w16se w16cid w16 w16cex w16sdtdh">
+<w:styles xmlns:mc="http://schemas.openxmlformats.org/markup-compatibility/2006" xmlns:r="http://schemas.openxmlformats.org/officeDocument/2006/relationships" xmlns:w="http://schemas.openxmlformats.org/wordprocessingml/2006/main" xmlns:w14="http://schemas.microsoft.com/office/word/2010/wordml" xmlns:w15="http://schemas.microsoft.com/office/word/2012/wordml" xmlns:w16cex="http://schemas.microsoft.com/office/word/2018/wordml/cex" xmlns:w16cid="http://schemas.microsoft.com/office/word/2016/wordml/cid" xmlns:w16="http://schemas.microsoft.com/office/word/2018/wordml" xmlns:w16du="http://schemas.microsoft.com/office/word/2023/wordml/word16du" xmlns:w16sdtdh="http://schemas.microsoft.com/office/word/2020/wordml/sdtdatahash" xmlns:w16sdtfl="http://schemas.microsoft.com/office/word/2024/wordml/sdtformatlock" xmlns:w16se="http://schemas.microsoft.com/office/word/2015/wordml/symex" mc:Ignorable="w14 w15 w16se w16cid w16 w16cex w16sdtdh w16sdtfl w16du">
   <w:docDefaults>
     <w:rPrDefault>
       <w:rPr>
@@ -1805,11 +1827,14 @@
   <w:style w:type="paragraph" w:default="1" w:styleId="Standard">
     <w:name w:val="Normal"/>
     <w:qFormat/>
-    <w:rsid w:val="00BF11F5"/>
+    <w:rsid w:val="000C7700"/>
     <w:pPr>
       <w:spacing w:after="160" w:line="276" w:lineRule="auto"/>
       <w:ind w:left="0" w:firstLine="0"/>
     </w:pPr>
+    <w:rPr>
+      <w:sz w:val="24"/>
+    </w:rPr>
   </w:style>
   <w:style w:type="paragraph" w:styleId="berschrift1">
     <w:name w:val="heading 1"/>
@@ -1818,7 +1843,7 @@
     <w:link w:val="berschrift1Zchn"/>
     <w:uiPriority w:val="7"/>
     <w:qFormat/>
-    <w:rsid w:val="00964401"/>
+    <w:rsid w:val="00584BF2"/>
     <w:pPr>
       <w:keepNext/>
       <w:keepLines/>
@@ -1828,8 +1853,9 @@
     </w:pPr>
     <w:rPr>
       <w:rFonts w:asciiTheme="majorHAnsi" w:eastAsiaTheme="majorEastAsia" w:hAnsiTheme="majorHAnsi" w:cstheme="majorBidi"/>
+      <w:b/>
       <w:color w:val="0271BB"/>
-      <w:sz w:val="32"/>
+      <w:sz w:val="36"/>
       <w:szCs w:val="32"/>
     </w:rPr>
   </w:style>
@@ -1840,7 +1866,7 @@
     <w:link w:val="berschrift2Zchn"/>
     <w:uiPriority w:val="8"/>
     <w:qFormat/>
-    <w:rsid w:val="00964401"/>
+    <w:rsid w:val="00584BF2"/>
     <w:pPr>
       <w:keepNext/>
       <w:keepLines/>
@@ -1850,8 +1876,9 @@
     </w:pPr>
     <w:rPr>
       <w:rFonts w:asciiTheme="majorHAnsi" w:eastAsiaTheme="majorEastAsia" w:hAnsiTheme="majorHAnsi" w:cstheme="majorBidi"/>
+      <w:b/>
       <w:color w:val="3B515B"/>
-      <w:sz w:val="28"/>
+      <w:sz w:val="32"/>
       <w:szCs w:val="26"/>
     </w:rPr>
   </w:style>
@@ -1862,7 +1889,7 @@
     <w:link w:val="berschrift3Zchn"/>
     <w:uiPriority w:val="9"/>
     <w:qFormat/>
-    <w:rsid w:val="00964401"/>
+    <w:rsid w:val="00584BF2"/>
     <w:pPr>
       <w:keepNext/>
       <w:keepLines/>
@@ -1872,8 +1899,9 @@
     </w:pPr>
     <w:rPr>
       <w:rFonts w:asciiTheme="majorHAnsi" w:eastAsiaTheme="majorEastAsia" w:hAnsiTheme="majorHAnsi" w:cstheme="majorBidi"/>
+      <w:b/>
       <w:color w:val="3B515B" w:themeColor="text1"/>
-      <w:sz w:val="24"/>
+      <w:sz w:val="28"/>
       <w:szCs w:val="24"/>
     </w:rPr>
   </w:style>
@@ -1896,7 +1924,6 @@
       <w:rFonts w:asciiTheme="majorHAnsi" w:eastAsiaTheme="majorEastAsia" w:hAnsiTheme="majorHAnsi" w:cstheme="majorBidi"/>
       <w:iCs/>
       <w:color w:val="3B515B" w:themeColor="text1"/>
-      <w:sz w:val="24"/>
     </w:rPr>
   </w:style>
   <w:style w:type="paragraph" w:styleId="berschrift5">
@@ -1918,7 +1945,6 @@
     <w:rPr>
       <w:rFonts w:asciiTheme="majorHAnsi" w:eastAsiaTheme="majorEastAsia" w:hAnsiTheme="majorHAnsi" w:cstheme="majorBidi"/>
       <w:color w:val="3B515B"/>
-      <w:sz w:val="24"/>
     </w:rPr>
   </w:style>
   <w:style w:type="paragraph" w:styleId="berschrift6">
@@ -2045,11 +2071,12 @@
     <w:basedOn w:val="Absatz-Standardschriftart"/>
     <w:link w:val="berschrift1"/>
     <w:uiPriority w:val="7"/>
-    <w:rsid w:val="00964401"/>
+    <w:rsid w:val="00584BF2"/>
     <w:rPr>
       <w:rFonts w:asciiTheme="majorHAnsi" w:eastAsiaTheme="majorEastAsia" w:hAnsiTheme="majorHAnsi" w:cstheme="majorBidi"/>
+      <w:b/>
       <w:color w:val="0271BB"/>
-      <w:sz w:val="32"/>
+      <w:sz w:val="36"/>
       <w:szCs w:val="32"/>
     </w:rPr>
   </w:style>
@@ -2061,7 +2088,7 @@
     <w:uiPriority w:val="10"/>
     <w:semiHidden/>
     <w:qFormat/>
-    <w:rsid w:val="00201A30"/>
+    <w:rsid w:val="007F0F1D"/>
     <w:pPr>
       <w:spacing w:before="600" w:after="0"/>
       <w:contextualSpacing/>
@@ -2070,6 +2097,7 @@
     </w:pPr>
     <w:rPr>
       <w:rFonts w:asciiTheme="majorHAnsi" w:eastAsiaTheme="majorEastAsia" w:hAnsiTheme="majorHAnsi" w:cstheme="majorBidi"/>
+      <w:b/>
       <w:color w:val="3B515B"/>
       <w:spacing w:val="-10"/>
       <w:kern w:val="28"/>
@@ -2083,9 +2111,10 @@
     <w:link w:val="Titel"/>
     <w:uiPriority w:val="10"/>
     <w:semiHidden/>
-    <w:rsid w:val="00201A30"/>
+    <w:rsid w:val="007F0F1D"/>
     <w:rPr>
       <w:rFonts w:asciiTheme="majorHAnsi" w:eastAsiaTheme="majorEastAsia" w:hAnsiTheme="majorHAnsi" w:cstheme="majorBidi"/>
+      <w:b/>
       <w:color w:val="3B515B"/>
       <w:spacing w:val="-10"/>
       <w:kern w:val="28"/>
@@ -2098,11 +2127,12 @@
     <w:basedOn w:val="Absatz-Standardschriftart"/>
     <w:link w:val="berschrift2"/>
     <w:uiPriority w:val="8"/>
-    <w:rsid w:val="00964401"/>
+    <w:rsid w:val="00584BF2"/>
     <w:rPr>
       <w:rFonts w:asciiTheme="majorHAnsi" w:eastAsiaTheme="majorEastAsia" w:hAnsiTheme="majorHAnsi" w:cstheme="majorBidi"/>
+      <w:b/>
       <w:color w:val="3B515B"/>
-      <w:sz w:val="28"/>
+      <w:sz w:val="32"/>
       <w:szCs w:val="26"/>
     </w:rPr>
   </w:style>
@@ -2111,11 +2141,12 @@
     <w:basedOn w:val="Absatz-Standardschriftart"/>
     <w:link w:val="berschrift3"/>
     <w:uiPriority w:val="9"/>
-    <w:rsid w:val="00964401"/>
+    <w:rsid w:val="00584BF2"/>
     <w:rPr>
       <w:rFonts w:asciiTheme="majorHAnsi" w:eastAsiaTheme="majorEastAsia" w:hAnsiTheme="majorHAnsi" w:cstheme="majorBidi"/>
+      <w:b/>
       <w:color w:val="3B515B" w:themeColor="text1"/>
-      <w:sz w:val="24"/>
+      <w:sz w:val="28"/>
       <w:szCs w:val="24"/>
     </w:rPr>
   </w:style>
@@ -2256,7 +2287,6 @@
     </w:pPr>
     <w:rPr>
       <w:rFonts w:ascii="TheSans UHH SemiLight Caps" w:hAnsi="TheSans UHH SemiLight Caps"/>
-      <w:sz w:val="24"/>
     </w:rPr>
   </w:style>
   <w:style w:type="character" w:customStyle="1" w:styleId="KopfzeileZchn">
@@ -2286,7 +2316,6 @@
     </w:pPr>
     <w:rPr>
       <w:rFonts w:ascii="TheSans UHH SemiLight Caps" w:hAnsi="TheSans UHH SemiLight Caps"/>
-      <w:sz w:val="24"/>
     </w:rPr>
   </w:style>
   <w:style w:type="character" w:customStyle="1" w:styleId="FuzeileZchn">
@@ -3640,7 +3669,6 @@
     </w:pPr>
     <w:rPr>
       <w:rFonts w:asciiTheme="majorHAnsi" w:eastAsiaTheme="majorEastAsia" w:hAnsiTheme="majorHAnsi" w:cstheme="majorBidi"/>
-      <w:sz w:val="24"/>
       <w:szCs w:val="24"/>
     </w:rPr>
   </w:style>
@@ -3716,7 +3744,6 @@
       <w:rFonts w:asciiTheme="majorHAnsi" w:eastAsiaTheme="majorEastAsia" w:hAnsiTheme="majorHAnsi" w:cstheme="majorBidi"/>
       <w:b/>
       <w:bCs/>
-      <w:sz w:val="24"/>
       <w:szCs w:val="24"/>
     </w:rPr>
   </w:style>
@@ -3729,7 +3756,6 @@
     <w:rsid w:val="00A04031"/>
     <w:rPr>
       <w:rFonts w:ascii="Times New Roman" w:hAnsi="Times New Roman" w:cs="Times New Roman"/>
-      <w:sz w:val="24"/>
       <w:szCs w:val="24"/>
     </w:rPr>
   </w:style>
@@ -4000,7 +4026,6 @@
     </w:pPr>
     <w:rPr>
       <w:rFonts w:asciiTheme="majorHAnsi" w:eastAsiaTheme="majorEastAsia" w:hAnsiTheme="majorHAnsi" w:cstheme="majorBidi"/>
-      <w:sz w:val="24"/>
       <w:szCs w:val="24"/>
     </w:rPr>
   </w:style>
@@ -4450,7 +4475,6 @@
     <w:rPr>
       <w:rFonts w:asciiTheme="majorHAnsi" w:eastAsiaTheme="majorEastAsia" w:hAnsiTheme="majorHAnsi" w:cstheme="majorBidi"/>
       <w:color w:val="3B515B" w:themeColor="text1"/>
-      <w:sz w:val="24"/>
       <w:szCs w:val="24"/>
       <w14:textOutline w14:w="0" w14:cap="rnd" w14:cmpd="sng" w14:algn="ctr">
         <w14:solidFill>
@@ -4811,13 +4835,14 @@
     <w:name w:val="Author"/>
     <w:basedOn w:val="Standard"/>
     <w:qFormat/>
-    <w:rsid w:val="00856E34"/>
+    <w:rsid w:val="00536B84"/>
     <w:pPr>
       <w:spacing w:before="240" w:after="360"/>
       <w:jc w:val="center"/>
     </w:pPr>
     <w:rPr>
       <w:rFonts w:asciiTheme="majorHAnsi" w:hAnsiTheme="majorHAnsi"/>
+      <w:b/>
       <w:color w:val="3B515B"/>
       <w:sz w:val="28"/>
       <w:lang w:val="en-US"/>

</xml_diff>